<commit_message>
Final commit of the project
</commit_message>
<xml_diff>
--- a/design/Issues-identified.docx
+++ b/design/Issues-identified.docx
@@ -4,12 +4,21 @@
   <w:body>
     <w:p>
       <w:pPr>
-        <w:rPr>
-          <w:lang w:val="en-US"/>
-        </w:rPr>
-      </w:pPr>
-      <w:r>
-        <w:rPr>
+        <w:jc w:val="center"/>
+        <w:rPr>
+          <w:b/>
+          <w:bCs/>
+          <w:sz w:val="36"/>
+          <w:szCs w:val="36"/>
+          <w:lang w:val="en-US"/>
+        </w:rPr>
+      </w:pPr>
+      <w:r>
+        <w:rPr>
+          <w:b/>
+          <w:bCs/>
+          <w:sz w:val="36"/>
+          <w:szCs w:val="36"/>
           <w:lang w:val="en-US"/>
         </w:rPr>
         <w:t>Issues Document</w:t>
@@ -26,6 +35,23 @@
           <w:lang w:val="en-US"/>
         </w:rPr>
         <w:t>Errors found:</w:t>
+      </w:r>
+    </w:p>
+    <w:p>
+      <w:pPr>
+        <w:ind w:left="360"/>
+        <w:jc w:val="center"/>
+        <w:rPr>
+          <w:u w:val="single"/>
+          <w:lang w:val="en-US"/>
+        </w:rPr>
+      </w:pPr>
+      <w:r>
+        <w:rPr>
+          <w:u w:val="single"/>
+          <w:lang w:val="en-US"/>
+        </w:rPr>
+        <w:t>On The HTML pages</w:t>
       </w:r>
     </w:p>
     <w:p>
@@ -43,7 +69,7 @@
         <w:rPr>
           <w:lang w:val="en-US"/>
         </w:rPr>
-        <w:t>A viewport meta element was also not specified on all pages</w:t>
+        <w:t>A viewport meta element was not specified on all pages</w:t>
       </w:r>
     </w:p>
     <w:p>
@@ -53,71 +79,32 @@
           <w:ilvl w:val="0"/>
           <w:numId w:val="1"/>
         </w:numPr>
-        <w:rPr>
-          <w:lang w:val="en-US"/>
-        </w:rPr>
-      </w:pPr>
-      <w:r>
-        <w:rPr>
-          <w:lang w:val="en-US"/>
-        </w:rPr>
-        <w:t xml:space="preserve">Errors </w:t>
-      </w:r>
-      <w:r>
-        <w:rPr>
-          <w:lang w:val="en-US"/>
-        </w:rPr>
-        <w:t>found</w:t>
-      </w:r>
-      <w:r>
-        <w:rPr>
-          <w:lang w:val="en-US"/>
-        </w:rPr>
-        <w:t xml:space="preserve"> on the image tags </w:t>
-      </w:r>
-      <w:proofErr w:type="gramStart"/>
-      <w:r>
-        <w:rPr>
-          <w:lang w:val="en-US"/>
-        </w:rPr>
-        <w:t>not have</w:t>
-      </w:r>
-      <w:proofErr w:type="gramEnd"/>
-      <w:r>
-        <w:rPr>
-          <w:lang w:val="en-US"/>
-        </w:rPr>
-        <w:t xml:space="preserve"> </w:t>
-      </w:r>
-      <w:r>
-        <w:rPr>
-          <w:lang w:val="en-US"/>
-        </w:rPr>
-        <w:t>title attributes</w:t>
-      </w:r>
-      <w:r>
-        <w:rPr>
-          <w:lang w:val="en-US"/>
-        </w:rPr>
-        <w:t xml:space="preserve"> that clearly describe</w:t>
-      </w:r>
-      <w:r>
-        <w:rPr>
-          <w:lang w:val="en-US"/>
-        </w:rPr>
-        <w:t xml:space="preserve"> </w:t>
-      </w:r>
-      <w:r>
-        <w:rPr>
-          <w:lang w:val="en-US"/>
-        </w:rPr>
-        <w:t>the image</w:t>
-      </w:r>
-      <w:r>
-        <w:rPr>
-          <w:lang w:val="en-US"/>
-        </w:rPr>
-        <w:t>.</w:t>
+      </w:pPr>
+      <w:r>
+        <w:rPr>
+          <w:lang w:val="en-US"/>
+        </w:rPr>
+        <w:t>The HTML tag was not declared with</w:t>
+      </w:r>
+      <w:r>
+        <w:t> </w:t>
+      </w:r>
+      <w:r>
+        <w:t>&lt;</w:t>
+      </w:r>
+      <w:r>
+        <w:t>lang="</w:t>
+      </w:r>
+      <w:proofErr w:type="spellStart"/>
+      <w:r>
+        <w:t>en</w:t>
+      </w:r>
+      <w:proofErr w:type="spellEnd"/>
+      <w:r>
+        <w:t>"&gt;</w:t>
+      </w:r>
+      <w:r>
+        <w:t xml:space="preserve"> which caused validation error.</w:t>
       </w:r>
     </w:p>
     <w:p>
@@ -135,7 +122,7 @@
         <w:rPr>
           <w:lang w:val="en-US"/>
         </w:rPr>
-        <w:t>Images did not have alternative texts</w:t>
+        <w:t>Errors found on the image tags do not have title attributes that clearly describe the image.</w:t>
       </w:r>
     </w:p>
     <w:p>
@@ -153,37 +140,7 @@
         <w:rPr>
           <w:lang w:val="en-US"/>
         </w:rPr>
-        <w:t xml:space="preserve"> The html</w:t>
-      </w:r>
-      <w:r>
-        <w:rPr>
-          <w:lang w:val="en-US"/>
-        </w:rPr>
-        <w:t xml:space="preserve"> </w:t>
-      </w:r>
-      <w:r>
-        <w:rPr>
-          <w:lang w:val="en-US"/>
-        </w:rPr>
-        <w:t>element d</w:t>
-      </w:r>
-      <w:r>
-        <w:rPr>
-          <w:lang w:val="en-US"/>
-        </w:rPr>
-        <w:t>id</w:t>
-      </w:r>
-      <w:r>
-        <w:rPr>
-          <w:lang w:val="en-US"/>
-        </w:rPr>
-        <w:t xml:space="preserve"> not have a lang attribute</w:t>
-      </w:r>
-      <w:r>
-        <w:rPr>
-          <w:lang w:val="en-US"/>
-        </w:rPr>
-        <w:t>.</w:t>
+        <w:t>Navigation was missing causing a break between pages, so I used &lt;nav&gt; elements together with &lt;a&gt; tags to ensure user flow.</w:t>
       </w:r>
     </w:p>
     <w:p>
@@ -201,31 +158,7 @@
         <w:rPr>
           <w:lang w:val="en-US"/>
         </w:rPr>
-        <w:t>The b</w:t>
-      </w:r>
-      <w:r>
-        <w:rPr>
-          <w:lang w:val="en-US"/>
-        </w:rPr>
-        <w:t xml:space="preserve">utton type attribute </w:t>
-      </w:r>
-      <w:r>
-        <w:rPr>
-          <w:lang w:val="en-US"/>
-        </w:rPr>
-        <w:t>was</w:t>
-      </w:r>
-      <w:r>
-        <w:rPr>
-          <w:lang w:val="en-US"/>
-        </w:rPr>
-        <w:t xml:space="preserve"> not</w:t>
-      </w:r>
-      <w:r>
-        <w:rPr>
-          <w:lang w:val="en-US"/>
-        </w:rPr>
-        <w:t xml:space="preserve"> set.</w:t>
+        <w:t>Images did not have alternative texts</w:t>
       </w:r>
     </w:p>
     <w:p>
@@ -243,9 +176,295 @@
         <w:rPr>
           <w:lang w:val="en-US"/>
         </w:rPr>
+        <w:t xml:space="preserve">Input type of a form declared email as a type of text so I changed it to email, I then included other fields such as id tags to link the label to the input, required and checked to ensure validation, </w:t>
+      </w:r>
+      <w:proofErr w:type="spellStart"/>
+      <w:r>
+        <w:rPr>
+          <w:lang w:val="en-US"/>
+        </w:rPr>
+        <w:t>minlength</w:t>
+      </w:r>
+      <w:proofErr w:type="spellEnd"/>
+      <w:r>
+        <w:rPr>
+          <w:lang w:val="en-US"/>
+        </w:rPr>
+        <w:t xml:space="preserve"> for the name input type, and pattern for email and phone number as well.</w:t>
+      </w:r>
+    </w:p>
+    <w:p>
+      <w:pPr>
+        <w:pStyle w:val="ListParagraph"/>
+        <w:numPr>
+          <w:ilvl w:val="0"/>
+          <w:numId w:val="1"/>
+        </w:numPr>
+        <w:rPr>
+          <w:lang w:val="en-US"/>
+        </w:rPr>
+      </w:pPr>
+      <w:r>
+        <w:rPr>
+          <w:lang w:val="en-US"/>
+        </w:rPr>
+        <w:t>I also included labels for all input types, a radio box for the communication type and a select type.</w:t>
+      </w:r>
+    </w:p>
+    <w:p>
+      <w:pPr>
+        <w:pStyle w:val="ListParagraph"/>
+        <w:numPr>
+          <w:ilvl w:val="0"/>
+          <w:numId w:val="1"/>
+        </w:numPr>
+        <w:rPr>
+          <w:lang w:val="en-US"/>
+        </w:rPr>
+      </w:pPr>
+      <w:r>
+        <w:rPr>
+          <w:lang w:val="en-US"/>
+        </w:rPr>
+        <w:t>The b</w:t>
+      </w:r>
+      <w:r>
+        <w:rPr>
+          <w:lang w:val="en-US"/>
+        </w:rPr>
+        <w:t xml:space="preserve">utton type attribute </w:t>
+      </w:r>
+      <w:r>
+        <w:rPr>
+          <w:lang w:val="en-US"/>
+        </w:rPr>
+        <w:t>was</w:t>
+      </w:r>
+      <w:r>
+        <w:rPr>
+          <w:lang w:val="en-US"/>
+        </w:rPr>
+        <w:t xml:space="preserve"> not set.</w:t>
+      </w:r>
+    </w:p>
+    <w:p>
+      <w:pPr>
+        <w:pStyle w:val="ListParagraph"/>
+        <w:numPr>
+          <w:ilvl w:val="0"/>
+          <w:numId w:val="1"/>
+        </w:numPr>
+        <w:rPr>
+          <w:lang w:val="en-US"/>
+        </w:rPr>
+      </w:pPr>
+      <w:r>
+        <w:rPr>
+          <w:lang w:val="en-US"/>
+        </w:rPr>
         <w:t>The charset meta element was not used on all HTML pages</w:t>
       </w:r>
     </w:p>
+    <w:p>
+      <w:pPr>
+        <w:pStyle w:val="ListParagraph"/>
+        <w:numPr>
+          <w:ilvl w:val="0"/>
+          <w:numId w:val="1"/>
+        </w:numPr>
+        <w:rPr>
+          <w:lang w:val="en-US"/>
+        </w:rPr>
+      </w:pPr>
+      <w:r>
+        <w:rPr>
+          <w:lang w:val="en-US"/>
+        </w:rPr>
+        <w:t xml:space="preserve">The document had poor </w:t>
+      </w:r>
+      <w:proofErr w:type="spellStart"/>
+      <w:r>
+        <w:rPr>
+          <w:lang w:val="en-US"/>
+        </w:rPr>
+        <w:t>colour</w:t>
+      </w:r>
+      <w:proofErr w:type="spellEnd"/>
+      <w:r>
+        <w:rPr>
+          <w:lang w:val="en-US"/>
+        </w:rPr>
+        <w:t xml:space="preserve"> contrast error, I fixed that too</w:t>
+      </w:r>
+    </w:p>
+    <w:p>
+      <w:pPr>
+        <w:jc w:val="center"/>
+        <w:rPr>
+          <w:lang w:val="en-US"/>
+        </w:rPr>
+      </w:pPr>
+    </w:p>
+    <w:p>
+      <w:pPr>
+        <w:jc w:val="center"/>
+        <w:rPr>
+          <w:u w:val="single"/>
+          <w:lang w:val="en-US"/>
+        </w:rPr>
+      </w:pPr>
+      <w:r>
+        <w:rPr>
+          <w:u w:val="single"/>
+          <w:lang w:val="en-US"/>
+        </w:rPr>
+        <w:t>On the CSS page</w:t>
+      </w:r>
+    </w:p>
+    <w:p>
+      <w:pPr>
+        <w:pStyle w:val="ListParagraph"/>
+        <w:numPr>
+          <w:ilvl w:val="0"/>
+          <w:numId w:val="2"/>
+        </w:numPr>
+        <w:rPr>
+          <w:lang w:val="en-US"/>
+        </w:rPr>
+      </w:pPr>
+      <w:r>
+        <w:t>The footer was misaligned, and spacing across sections was inconsistent.</w:t>
+      </w:r>
+      <w:r>
+        <w:t xml:space="preserve"> </w:t>
+      </w:r>
+    </w:p>
+    <w:p>
+      <w:pPr>
+        <w:pStyle w:val="ListParagraph"/>
+        <w:numPr>
+          <w:ilvl w:val="0"/>
+          <w:numId w:val="2"/>
+        </w:numPr>
+        <w:rPr>
+          <w:lang w:val="en-US"/>
+        </w:rPr>
+      </w:pPr>
+      <w:r>
+        <w:rPr>
+          <w:lang w:val="en-US"/>
+        </w:rPr>
+        <w:t xml:space="preserve">The </w:t>
+      </w:r>
+      <w:proofErr w:type="spellStart"/>
+      <w:r>
+        <w:rPr>
+          <w:lang w:val="en-US"/>
+        </w:rPr>
+        <w:t>colour</w:t>
+      </w:r>
+      <w:proofErr w:type="spellEnd"/>
+      <w:r>
+        <w:rPr>
+          <w:lang w:val="en-US"/>
+        </w:rPr>
+        <w:t xml:space="preserve"> contrast was poor, affecting accessibility</w:t>
+      </w:r>
+    </w:p>
+    <w:p>
+      <w:pPr>
+        <w:pStyle w:val="ListParagraph"/>
+        <w:numPr>
+          <w:ilvl w:val="0"/>
+          <w:numId w:val="2"/>
+        </w:numPr>
+        <w:rPr>
+          <w:lang w:val="en-US"/>
+        </w:rPr>
+      </w:pPr>
+      <w:r>
+        <w:rPr>
+          <w:lang w:val="en-US"/>
+        </w:rPr>
+        <w:t>The hero image had sizing issues with no limit to its width, when the web page expands it also expands covering the entire screen</w:t>
+      </w:r>
+    </w:p>
+    <w:p>
+      <w:pPr>
+        <w:pStyle w:val="ListParagraph"/>
+        <w:numPr>
+          <w:ilvl w:val="0"/>
+          <w:numId w:val="2"/>
+        </w:numPr>
+        <w:rPr>
+          <w:lang w:val="en-US"/>
+        </w:rPr>
+      </w:pPr>
+      <w:r>
+        <w:rPr>
+          <w:lang w:val="en-US"/>
+        </w:rPr>
+        <w:t>The spacing was also not consistent and there was also alignment issues identified.</w:t>
+      </w:r>
+    </w:p>
+    <w:p>
+      <w:pPr>
+        <w:pStyle w:val="ListParagraph"/>
+        <w:numPr>
+          <w:ilvl w:val="0"/>
+          <w:numId w:val="2"/>
+        </w:numPr>
+        <w:rPr>
+          <w:lang w:val="en-US"/>
+        </w:rPr>
+      </w:pPr>
+      <w:r>
+        <w:rPr>
+          <w:lang w:val="en-US"/>
+        </w:rPr>
+        <w:t>The were no responsive adjustments declared in the CSS file.</w:t>
+      </w:r>
+    </w:p>
+    <w:p>
+      <w:pPr>
+        <w:pStyle w:val="ListParagraph"/>
+        <w:numPr>
+          <w:ilvl w:val="0"/>
+          <w:numId w:val="2"/>
+        </w:numPr>
+        <w:rPr>
+          <w:lang w:val="en-US"/>
+        </w:rPr>
+      </w:pPr>
+      <w:r>
+        <w:rPr>
+          <w:lang w:val="en-US"/>
+        </w:rPr>
+        <w:t>There we inconsistencies in the formatting and indentation of the pages.</w:t>
+      </w:r>
+    </w:p>
+    <w:p>
+      <w:pPr>
+        <w:rPr>
+          <w:lang w:val="en-US"/>
+        </w:rPr>
+      </w:pPr>
+    </w:p>
+    <w:p>
+      <w:pPr>
+        <w:rPr>
+          <w:lang w:val="en-US"/>
+        </w:rPr>
+      </w:pPr>
+    </w:p>
+    <w:p>
+      <w:pPr>
+        <w:rPr>
+          <w:lang w:val="en-US"/>
+        </w:rPr>
+      </w:pPr>
+    </w:p>
+    <w:p/>
     <w:sectPr>
       <w:pgSz w:w="11906" w:h="16838"/>
       <w:pgMar w:top="1440" w:right="1440" w:bottom="1440" w:left="1440" w:header="708" w:footer="708" w:gutter="0"/>
@@ -259,6 +478,92 @@
 <file path=word/numbering.xml><?xml version="1.0" encoding="utf-8"?>
 <w:numbering xmlns:wpc="http://schemas.microsoft.com/office/word/2010/wordprocessingCanvas" xmlns:cx="http://schemas.microsoft.com/office/drawing/2014/chartex" xmlns:cx1="http://schemas.microsoft.com/office/drawing/2015/9/8/chartex" xmlns:cx2="http://schemas.microsoft.com/office/drawing/2015/10/21/chartex" xmlns:cx3="http://schemas.microsoft.com/office/drawing/2016/5/9/chartex" xmlns:cx4="http://schemas.microsoft.com/office/drawing/2016/5/10/chartex" xmlns:cx5="http://schemas.microsoft.com/office/drawing/2016/5/11/chartex" xmlns:cx6="http://schemas.microsoft.com/office/drawing/2016/5/12/chartex" xmlns:cx7="http://schemas.microsoft.com/office/drawing/2016/5/13/chartex" xmlns:cx8="http://schemas.microsoft.com/office/drawing/2016/5/14/chartex" xmlns:mc="http://schemas.openxmlformats.org/markup-compatibility/2006" xmlns:aink="http://schemas.microsoft.com/office/drawing/2016/ink" xmlns:am3d="http://schemas.microsoft.com/office/drawing/2017/model3d" xmlns:o="urn:schemas-microsoft-com:office:office" xmlns:oel="http://schemas.microsoft.com/office/2019/extlst" xmlns:r="http://schemas.openxmlformats.org/officeDocument/2006/relationships" xmlns:m="http://schemas.openxmlformats.org/officeDocument/2006/math" xmlns:v="urn:schemas-microsoft-com:vml" xmlns:wp14="http://schemas.microsoft.com/office/word/2010/wordprocessingDrawing" xmlns:wp="http://schemas.openxmlformats.org/drawingml/2006/wordprocessingDrawing" xmlns:w10="urn:schemas-microsoft-com:office:word" xmlns:w="http://schemas.openxmlformats.org/wordprocessingml/2006/main" xmlns:w14="http://schemas.microsoft.com/office/word/2010/wordml" xmlns:w15="http://schemas.microsoft.com/office/word/2012/wordml" xmlns:w16cex="http://schemas.microsoft.com/office/word/2018/wordml/cex" xmlns:w16cid="http://schemas.microsoft.com/office/word/2016/wordml/cid" xmlns:w16="http://schemas.microsoft.com/office/word/2018/wordml" xmlns:w16du="http://schemas.microsoft.com/office/word/2023/wordml/word16du" xmlns:w16sdtdh="http://schemas.microsoft.com/office/word/2020/wordml/sdtdatahash" xmlns:w16sdtfl="http://schemas.microsoft.com/office/word/2024/wordml/sdtformatlock" xmlns:w16se="http://schemas.microsoft.com/office/word/2015/wordml/symex" xmlns:wpg="http://schemas.microsoft.com/office/word/2010/wordprocessingGroup" xmlns:wpi="http://schemas.microsoft.com/office/word/2010/wordprocessingInk" xmlns:wne="http://schemas.microsoft.com/office/word/2006/wordml" xmlns:wps="http://schemas.microsoft.com/office/word/2010/wordprocessingShape" mc:Ignorable="w14 w15 w16se w16cid w16 w16cex w16sdtdh w16sdtfl w16du wp14">
   <w:abstractNum w:abstractNumId="0" w15:restartNumberingAfterBreak="0">
+    <w:nsid w:val="4B5F310C"/>
+    <w:multiLevelType w:val="hybridMultilevel"/>
+    <w:tmpl w:val="8A58FA04"/>
+    <w:lvl w:ilvl="0" w:tplc="1C09000F">
+      <w:start w:val="1"/>
+      <w:numFmt w:val="decimal"/>
+      <w:lvlText w:val="%1."/>
+      <w:lvlJc w:val="left"/>
+      <w:pPr>
+        <w:ind w:left="720" w:hanging="360"/>
+      </w:pPr>
+    </w:lvl>
+    <w:lvl w:ilvl="1" w:tplc="1C090019" w:tentative="1">
+      <w:start w:val="1"/>
+      <w:numFmt w:val="lowerLetter"/>
+      <w:lvlText w:val="%2."/>
+      <w:lvlJc w:val="left"/>
+      <w:pPr>
+        <w:ind w:left="1440" w:hanging="360"/>
+      </w:pPr>
+    </w:lvl>
+    <w:lvl w:ilvl="2" w:tplc="1C09001B" w:tentative="1">
+      <w:start w:val="1"/>
+      <w:numFmt w:val="lowerRoman"/>
+      <w:lvlText w:val="%3."/>
+      <w:lvlJc w:val="right"/>
+      <w:pPr>
+        <w:ind w:left="2160" w:hanging="180"/>
+      </w:pPr>
+    </w:lvl>
+    <w:lvl w:ilvl="3" w:tplc="1C09000F" w:tentative="1">
+      <w:start w:val="1"/>
+      <w:numFmt w:val="decimal"/>
+      <w:lvlText w:val="%4."/>
+      <w:lvlJc w:val="left"/>
+      <w:pPr>
+        <w:ind w:left="2880" w:hanging="360"/>
+      </w:pPr>
+    </w:lvl>
+    <w:lvl w:ilvl="4" w:tplc="1C090019" w:tentative="1">
+      <w:start w:val="1"/>
+      <w:numFmt w:val="lowerLetter"/>
+      <w:lvlText w:val="%5."/>
+      <w:lvlJc w:val="left"/>
+      <w:pPr>
+        <w:ind w:left="3600" w:hanging="360"/>
+      </w:pPr>
+    </w:lvl>
+    <w:lvl w:ilvl="5" w:tplc="1C09001B" w:tentative="1">
+      <w:start w:val="1"/>
+      <w:numFmt w:val="lowerRoman"/>
+      <w:lvlText w:val="%6."/>
+      <w:lvlJc w:val="right"/>
+      <w:pPr>
+        <w:ind w:left="4320" w:hanging="180"/>
+      </w:pPr>
+    </w:lvl>
+    <w:lvl w:ilvl="6" w:tplc="1C09000F" w:tentative="1">
+      <w:start w:val="1"/>
+      <w:numFmt w:val="decimal"/>
+      <w:lvlText w:val="%7."/>
+      <w:lvlJc w:val="left"/>
+      <w:pPr>
+        <w:ind w:left="5040" w:hanging="360"/>
+      </w:pPr>
+    </w:lvl>
+    <w:lvl w:ilvl="7" w:tplc="1C090019" w:tentative="1">
+      <w:start w:val="1"/>
+      <w:numFmt w:val="lowerLetter"/>
+      <w:lvlText w:val="%8."/>
+      <w:lvlJc w:val="left"/>
+      <w:pPr>
+        <w:ind w:left="5760" w:hanging="360"/>
+      </w:pPr>
+    </w:lvl>
+    <w:lvl w:ilvl="8" w:tplc="1C09001B" w:tentative="1">
+      <w:start w:val="1"/>
+      <w:numFmt w:val="lowerRoman"/>
+      <w:lvlText w:val="%9."/>
+      <w:lvlJc w:val="right"/>
+      <w:pPr>
+        <w:ind w:left="6480" w:hanging="180"/>
+      </w:pPr>
+    </w:lvl>
+  </w:abstractNum>
+  <w:abstractNum w:abstractNumId="1" w15:restartNumberingAfterBreak="0">
     <w:nsid w:val="63004C03"/>
     <w:multiLevelType w:val="hybridMultilevel"/>
     <w:tmpl w:val="BBC285B8"/>
@@ -348,6 +653,9 @@
     </w:lvl>
   </w:abstractNum>
   <w:num w:numId="1" w16cid:durableId="1937058754">
+    <w:abstractNumId w:val="1"/>
+  </w:num>
+  <w:num w:numId="2" w16cid:durableId="1832062758">
     <w:abstractNumId w:val="0"/>
   </w:num>
 </w:numbering>
@@ -753,6 +1061,7 @@
   <w:style w:type="paragraph" w:default="1" w:styleId="Normal">
     <w:name w:val="Normal"/>
     <w:qFormat/>
+    <w:rsid w:val="00ED08E2"/>
   </w:style>
   <w:style w:type="paragraph" w:styleId="Heading1">
     <w:name w:val="heading 1"/>

</xml_diff>

<commit_message>
Fixed all minor issues on all files
</commit_message>
<xml_diff>
--- a/design/Issues-identified.docx
+++ b/design/Issues-identified.docx
@@ -282,43 +282,23 @@
         </w:rPr>
         <w:t xml:space="preserve">The document had poor </w:t>
       </w:r>
-      <w:proofErr w:type="spellStart"/>
-      <w:r>
-        <w:rPr>
-          <w:lang w:val="en-US"/>
-        </w:rPr>
-        <w:t>colour</w:t>
-      </w:r>
-      <w:proofErr w:type="spellEnd"/>
+      <w:r>
+        <w:rPr>
+          <w:lang w:val="en-US"/>
+        </w:rPr>
+        <w:t>color</w:t>
+      </w:r>
       <w:r>
         <w:rPr>
           <w:lang w:val="en-US"/>
         </w:rPr>
         <w:t xml:space="preserve"> contrast error, I fixed that too</w:t>
       </w:r>
-    </w:p>
-    <w:p>
-      <w:pPr>
-        <w:jc w:val="center"/>
-        <w:rPr>
-          <w:lang w:val="en-US"/>
-        </w:rPr>
-      </w:pPr>
-    </w:p>
-    <w:p>
-      <w:pPr>
-        <w:jc w:val="center"/>
-        <w:rPr>
-          <w:u w:val="single"/>
-          <w:lang w:val="en-US"/>
-        </w:rPr>
-      </w:pPr>
-      <w:r>
-        <w:rPr>
-          <w:u w:val="single"/>
-          <w:lang w:val="en-US"/>
-        </w:rPr>
-        <w:t>On the CSS page</w:t>
+      <w:r>
+        <w:t>The footer was misaligned, and spacing across sections was inconsistent.</w:t>
+      </w:r>
+      <w:r>
+        <w:t xml:space="preserve"> </w:t>
       </w:r>
     </w:p>
     <w:p>
@@ -326,17 +306,59 @@
         <w:pStyle w:val="ListParagraph"/>
         <w:numPr>
           <w:ilvl w:val="0"/>
-          <w:numId w:val="2"/>
+          <w:numId w:val="1"/>
         </w:numPr>
-        <w:rPr>
-          <w:lang w:val="en-US"/>
-        </w:rPr>
-      </w:pPr>
-      <w:r>
-        <w:t>The footer was misaligned, and spacing across sections was inconsistent.</w:t>
-      </w:r>
-      <w:r>
-        <w:t xml:space="preserve"> </w:t>
+      </w:pPr>
+      <w:r>
+        <w:rPr>
+          <w:lang w:val="en-US"/>
+        </w:rPr>
+        <w:t xml:space="preserve">The </w:t>
+      </w:r>
+      <w:r>
+        <w:rPr>
+          <w:lang w:val="en-US"/>
+        </w:rPr>
+        <w:t>color</w:t>
+      </w:r>
+      <w:r>
+        <w:rPr>
+          <w:lang w:val="en-US"/>
+        </w:rPr>
+        <w:t xml:space="preserve"> contrast was poor, affecting accessibility</w:t>
+      </w:r>
+      <w:r>
+        <w:rPr>
+          <w:lang w:val="en-US"/>
+        </w:rPr>
+        <w:t xml:space="preserve">, </w:t>
+      </w:r>
+      <w:r>
+        <w:t>all colo</w:t>
+      </w:r>
+      <w:r>
+        <w:t>u</w:t>
+      </w:r>
+      <w:r>
+        <w:t xml:space="preserve">r combinations </w:t>
+      </w:r>
+      <w:r>
+        <w:t xml:space="preserve">are </w:t>
+      </w:r>
+      <w:r>
+        <w:t xml:space="preserve">accessible </w:t>
+      </w:r>
+      <w:r>
+        <w:t xml:space="preserve">to </w:t>
+      </w:r>
+      <w:r>
+        <w:t>contrast ratio</w:t>
+      </w:r>
+      <w:r>
+        <w:t xml:space="preserve"> greater than </w:t>
+      </w:r>
+      <w:r>
+        <w:t xml:space="preserve"> 4.5:1</w:t>
       </w:r>
     </w:p>
     <w:p>
@@ -344,7 +366,7 @@
         <w:pStyle w:val="ListParagraph"/>
         <w:numPr>
           <w:ilvl w:val="0"/>
-          <w:numId w:val="2"/>
+          <w:numId w:val="1"/>
         </w:numPr>
         <w:rPr>
           <w:lang w:val="en-US"/>
@@ -354,21 +376,7 @@
         <w:rPr>
           <w:lang w:val="en-US"/>
         </w:rPr>
-        <w:t xml:space="preserve">The </w:t>
-      </w:r>
-      <w:proofErr w:type="spellStart"/>
-      <w:r>
-        <w:rPr>
-          <w:lang w:val="en-US"/>
-        </w:rPr>
-        <w:t>colour</w:t>
-      </w:r>
-      <w:proofErr w:type="spellEnd"/>
-      <w:r>
-        <w:rPr>
-          <w:lang w:val="en-US"/>
-        </w:rPr>
-        <w:t xml:space="preserve"> contrast was poor, affecting accessibility</w:t>
+        <w:t>The hero image had sizing issues with no limit to its width, when the web page expands it also expands covering the entire screen</w:t>
       </w:r>
     </w:p>
     <w:p>
@@ -376,7 +384,7 @@
         <w:pStyle w:val="ListParagraph"/>
         <w:numPr>
           <w:ilvl w:val="0"/>
-          <w:numId w:val="2"/>
+          <w:numId w:val="1"/>
         </w:numPr>
         <w:rPr>
           <w:lang w:val="en-US"/>
@@ -386,7 +394,7 @@
         <w:rPr>
           <w:lang w:val="en-US"/>
         </w:rPr>
-        <w:t>The hero image had sizing issues with no limit to its width, when the web page expands it also expands covering the entire screen</w:t>
+        <w:t>The spacing was also not consistent and there was also alignment issues identified.</w:t>
       </w:r>
     </w:p>
     <w:p>
@@ -394,7 +402,7 @@
         <w:pStyle w:val="ListParagraph"/>
         <w:numPr>
           <w:ilvl w:val="0"/>
-          <w:numId w:val="2"/>
+          <w:numId w:val="1"/>
         </w:numPr>
         <w:rPr>
           <w:lang w:val="en-US"/>
@@ -404,7 +412,7 @@
         <w:rPr>
           <w:lang w:val="en-US"/>
         </w:rPr>
-        <w:t>The spacing was also not consistent and there was also alignment issues identified.</w:t>
+        <w:t>The were no responsive adjustments declared in the CSS file.</w:t>
       </w:r>
     </w:p>
     <w:p>
@@ -412,25 +420,7 @@
         <w:pStyle w:val="ListParagraph"/>
         <w:numPr>
           <w:ilvl w:val="0"/>
-          <w:numId w:val="2"/>
-        </w:numPr>
-        <w:rPr>
-          <w:lang w:val="en-US"/>
-        </w:rPr>
-      </w:pPr>
-      <w:r>
-        <w:rPr>
-          <w:lang w:val="en-US"/>
-        </w:rPr>
-        <w:t>The were no responsive adjustments declared in the CSS file.</w:t>
-      </w:r>
-    </w:p>
-    <w:p>
-      <w:pPr>
-        <w:pStyle w:val="ListParagraph"/>
-        <w:numPr>
-          <w:ilvl w:val="0"/>
-          <w:numId w:val="2"/>
+          <w:numId w:val="1"/>
         </w:numPr>
         <w:rPr>
           <w:lang w:val="en-US"/>
@@ -1265,7 +1255,6 @@
   <w:style w:type="character" w:default="1" w:styleId="DefaultParagraphFont">
     <w:name w:val="Default Paragraph Font"/>
     <w:uiPriority w:val="1"/>
-    <w:semiHidden/>
     <w:unhideWhenUsed/>
   </w:style>
   <w:style w:type="table" w:default="1" w:styleId="TableNormal">
@@ -1577,6 +1566,17 @@
       <w:smallCaps/>
       <w:color w:val="2F5496" w:themeColor="accent1" w:themeShade="BF"/>
       <w:spacing w:val="5"/>
+    </w:rPr>
+  </w:style>
+  <w:style w:type="paragraph" w:styleId="NormalWeb">
+    <w:name w:val="Normal (Web)"/>
+    <w:basedOn w:val="Normal"/>
+    <w:uiPriority w:val="99"/>
+    <w:semiHidden/>
+    <w:unhideWhenUsed/>
+    <w:rsid w:val="00360457"/>
+    <w:rPr>
+      <w:rFonts w:ascii="Times New Roman" w:hAnsi="Times New Roman" w:cs="Times New Roman"/>
     </w:rPr>
   </w:style>
 </w:styles>

</xml_diff>